<commit_message>
Add working GitHub DOCX update demo
</commit_message>
<xml_diff>
--- a/samples/techdocker_test1.docx
+++ b/samples/techdocker_test1.docx
@@ -420,6 +420,72 @@
       </w:r>
     </w:p>
     <w:p/>
+    <w:p>
+      <w:pPr>
+        <w:pStyle w:val="Heading1"/>
+      </w:pPr>
+      <w:r>
+        <w:t>Automated Documentation Update</w:t>
+      </w:r>
+    </w:p>
+    <w:p>
+      <w:r>
+        <w:t>Timestamp: 2026-07-09 06:26:36 UTC</w:t>
+      </w:r>
+    </w:p>
+    <w:p>
+      <w:r>
+        <w:t>Repository: TechDocker</w:t>
+      </w:r>
+    </w:p>
+    <w:p>
+      <w:r>
+        <w:t>Branch: main</w:t>
+      </w:r>
+    </w:p>
+    <w:p>
+      <w:r>
+        <w:t>Actor: local-user</w:t>
+      </w:r>
+    </w:p>
+    <w:p>
+      <w:r>
+        <w:t>Before SHA: HEAD~1</w:t>
+      </w:r>
+    </w:p>
+    <w:p>
+      <w:r>
+        <w:t>After SHA: HEAD</w:t>
+      </w:r>
+    </w:p>
+    <w:p>
+      <w:r>
+        <w:t>Project ID: techdocker</w:t>
+      </w:r>
+    </w:p>
+    <w:p>
+      <w:r>
+        <w:t>Document: techdocker_test1.docx</w:t>
+      </w:r>
+    </w:p>
+    <w:p>
+      <w:pPr>
+        <w:pStyle w:val="Heading2"/>
+      </w:pPr>
+      <w:r>
+        <w:t>Changed Files</w:t>
+      </w:r>
+    </w:p>
+    <w:p>
+      <w:r>
+        <w:t>- deleted: "feature-extractor-test-analysis.csv\342\200\250"</w:t>
+      </w:r>
+    </w:p>
+    <w:p>
+      <w:r>
+        <w:t>This section was generated automatically by the TechDocker GitHub automation demo.</w:t>
+      </w:r>
+    </w:p>
     <w:sectPr>
       <w:pgSz w:w="12240" w:h="15840"/>
       <w:pgMar w:top="1440" w:right="1440" w:bottom="1440" w:left="1440" w:header="720" w:footer="720" w:gutter="0"/>

</xml_diff>

<commit_message>
Add persistent document skeleton routing
</commit_message>
<xml_diff>
--- a/samples/techdocker_test1.docx
+++ b/samples/techdocker_test1.docx
@@ -420,401 +420,6 @@
       </w:r>
     </w:p>
     <w:p/>
-    <w:p>
-      <w:pPr>
-        <w:pStyle w:val="Heading1"/>
-      </w:pPr>
-      <w:r>
-        <w:t>Automated Documentation Update</w:t>
-      </w:r>
-    </w:p>
-    <w:p>
-      <w:r>
-        <w:t>Timestamp: 2026-07-09 06:26:36 UTC</w:t>
-      </w:r>
-    </w:p>
-    <w:p>
-      <w:r>
-        <w:t>Repository: TechDocker</w:t>
-      </w:r>
-    </w:p>
-    <w:p>
-      <w:r>
-        <w:t>Branch: main</w:t>
-      </w:r>
-    </w:p>
-    <w:p>
-      <w:r>
-        <w:t>Actor: local-user</w:t>
-      </w:r>
-    </w:p>
-    <w:p>
-      <w:r>
-        <w:t>Before SHA: HEAD~1</w:t>
-      </w:r>
-    </w:p>
-    <w:p>
-      <w:r>
-        <w:t>After SHA: HEAD</w:t>
-      </w:r>
-    </w:p>
-    <w:p>
-      <w:r>
-        <w:t>Project ID: techdocker</w:t>
-      </w:r>
-    </w:p>
-    <w:p>
-      <w:r>
-        <w:t>Document: techdocker_test1.docx</w:t>
-      </w:r>
-    </w:p>
-    <w:p>
-      <w:pPr>
-        <w:pStyle w:val="Heading2"/>
-      </w:pPr>
-      <w:r>
-        <w:t>Changed Files</w:t>
-      </w:r>
-    </w:p>
-    <w:p>
-      <w:r>
-        <w:t>- deleted: "feature-extractor-test-analysis.csv\342\200\250"</w:t>
-      </w:r>
-    </w:p>
-    <w:p>
-      <w:r>
-        <w:t>This section was generated automatically by the TechDocker GitHub automation demo.</w:t>
-      </w:r>
-    </w:p>
-    <w:p>
-      <w:pPr>
-        <w:pStyle w:val="Heading1"/>
-      </w:pPr>
-      <w:r>
-        <w:t>Automated Documentation Update</w:t>
-      </w:r>
-    </w:p>
-    <w:p>
-      <w:r>
-        <w:t>Timestamp: 2026-07-09 06:37:22 UTC</w:t>
-      </w:r>
-    </w:p>
-    <w:p>
-      <w:r>
-        <w:t>Repository: TechDocker</w:t>
-      </w:r>
-    </w:p>
-    <w:p>
-      <w:r>
-        <w:t>Branch: main</w:t>
-      </w:r>
-    </w:p>
-    <w:p>
-      <w:r>
-        <w:t>Actor: AdrenalIsland1</w:t>
-      </w:r>
-    </w:p>
-    <w:p>
-      <w:r>
-        <w:t>Before SHA: b28c8e7d3904bfc815746433a88ab93b58ceda26</w:t>
-      </w:r>
-    </w:p>
-    <w:p>
-      <w:r>
-        <w:t>After SHA: af0a6cd43c45fd8e428577b3810d49b2b6284b8b</w:t>
-      </w:r>
-    </w:p>
-    <w:p>
-      <w:r>
-        <w:t>Project ID: techdocker</w:t>
-      </w:r>
-    </w:p>
-    <w:p>
-      <w:r>
-        <w:t>Document: techdocker_test1.docx</w:t>
-      </w:r>
-    </w:p>
-    <w:p>
-      <w:pPr>
-        <w:pStyle w:val="Heading2"/>
-      </w:pPr>
-      <w:r>
-        <w:t>Changed Files</w:t>
-      </w:r>
-    </w:p>
-    <w:p>
-      <w:r>
-        <w:t>- added: .github/workflows/documentation-update.yml</w:t>
-      </w:r>
-    </w:p>
-    <w:p>
-      <w:r>
-        <w:t>- modified: README.md</w:t>
-      </w:r>
-    </w:p>
-    <w:p>
-      <w:r>
-        <w:t>- added: config/projects.json</w:t>
-      </w:r>
-    </w:p>
-    <w:p>
-      <w:r>
-        <w:t>- modified: samples/techdocker_test1.docx</w:t>
-      </w:r>
-    </w:p>
-    <w:p>
-      <w:r>
-        <w:t>- added: src/automation_demo.py</w:t>
-      </w:r>
-    </w:p>
-    <w:p>
-      <w:r>
-        <w:t>- added: src/demo_docx_updater.py</w:t>
-      </w:r>
-    </w:p>
-    <w:p>
-      <w:r>
-        <w:t>- added: src/git_change_detector.py</w:t>
-      </w:r>
-    </w:p>
-    <w:p>
-      <w:r>
-        <w:t>- added: src/project_resolver.py</w:t>
-      </w:r>
-    </w:p>
-    <w:p>
-      <w:r>
-        <w:t>- added: tests/test_automation_demo.py</w:t>
-      </w:r>
-    </w:p>
-    <w:p>
-      <w:r>
-        <w:t>- added: tests/test_demo_docx_updater.py</w:t>
-      </w:r>
-    </w:p>
-    <w:p>
-      <w:r>
-        <w:t>- added: tests/test_git_change_detector.py</w:t>
-      </w:r>
-    </w:p>
-    <w:p>
-      <w:r>
-        <w:t>- added: tests/test_project_resolver.py</w:t>
-      </w:r>
-    </w:p>
-    <w:p>
-      <w:r>
-        <w:t>This section was generated automatically by the TechDocker GitHub automation demo.</w:t>
-      </w:r>
-    </w:p>
-    <w:p>
-      <w:pPr>
-        <w:pStyle w:val="Heading1"/>
-      </w:pPr>
-      <w:r>
-        <w:t>Automated Documentation Update</w:t>
-      </w:r>
-    </w:p>
-    <w:p>
-      <w:r>
-        <w:t>Timestamp: 2026-07-09 06:56:41 UTC</w:t>
-      </w:r>
-    </w:p>
-    <w:p>
-      <w:r>
-        <w:t>Repository: TechDocker</w:t>
-      </w:r>
-    </w:p>
-    <w:p>
-      <w:r>
-        <w:t>Branch: main</w:t>
-      </w:r>
-    </w:p>
-    <w:p>
-      <w:r>
-        <w:t>Actor: AdrenalIsland1</w:t>
-      </w:r>
-    </w:p>
-    <w:p>
-      <w:r>
-        <w:t>Before SHA: e568d52a262f4ad5045e7c4c54ded1960883f010</w:t>
-      </w:r>
-    </w:p>
-    <w:p>
-      <w:r>
-        <w:t>After SHA: 9defc29bdcc644c4fdf38e9f308e59df39dcd17a</w:t>
-      </w:r>
-    </w:p>
-    <w:p>
-      <w:r>
-        <w:t>Project ID: techdocker</w:t>
-      </w:r>
-    </w:p>
-    <w:p>
-      <w:r>
-        <w:t>Document: techdocker_test1.docx</w:t>
-      </w:r>
-    </w:p>
-    <w:p>
-      <w:pPr>
-        <w:pStyle w:val="Heading2"/>
-      </w:pPr>
-      <w:r>
-        <w:t>Changed Files</w:t>
-      </w:r>
-    </w:p>
-    <w:p>
-      <w:r>
-        <w:t>- modified: docs/github-automation-plan.md</w:t>
-      </w:r>
-    </w:p>
-    <w:p>
-      <w:r>
-        <w:t>This section was generated automatically by the TechDocker GitHub automation demo.</w:t>
-      </w:r>
-    </w:p>
-    <w:p>
-      <w:pPr>
-        <w:pStyle w:val="Heading1"/>
-      </w:pPr>
-      <w:r>
-        <w:t>Automated Documentation Update</w:t>
-      </w:r>
-    </w:p>
-    <w:p>
-      <w:r>
-        <w:t>Timestamp: 2026-07-09 09:23:28 UTC</w:t>
-      </w:r>
-    </w:p>
-    <w:p>
-      <w:r>
-        <w:t>Repository: TechDocker</w:t>
-      </w:r>
-    </w:p>
-    <w:p>
-      <w:r>
-        <w:t>Branch: main</w:t>
-      </w:r>
-    </w:p>
-    <w:p>
-      <w:r>
-        <w:t>Actor: AdrenalIsland1</w:t>
-      </w:r>
-    </w:p>
-    <w:p>
-      <w:r>
-        <w:t>Before SHA: c9d78fc88425b03f5d55b82581b13a401fefe92d</w:t>
-      </w:r>
-    </w:p>
-    <w:p>
-      <w:r>
-        <w:t>After SHA: a3874b8ab938ad05014fb01358d676bf76267c9d</w:t>
-      </w:r>
-    </w:p>
-    <w:p>
-      <w:r>
-        <w:t>Project ID: techdocker</w:t>
-      </w:r>
-    </w:p>
-    <w:p>
-      <w:r>
-        <w:t>Document: techdocker_test1.docx</w:t>
-      </w:r>
-    </w:p>
-    <w:p>
-      <w:pPr>
-        <w:pStyle w:val="Heading2"/>
-      </w:pPr>
-      <w:r>
-        <w:t>Changed Files</w:t>
-      </w:r>
-    </w:p>
-    <w:p>
-      <w:r>
-        <w:t>- deleted: samples/~$chdocker_test1.docx</w:t>
-      </w:r>
-    </w:p>
-    <w:p>
-      <w:r>
-        <w:t>- added: tests/test2.txt</w:t>
-      </w:r>
-    </w:p>
-    <w:p>
-      <w:r>
-        <w:t>This section was generated automatically by the TechDocker GitHub automation demo.</w:t>
-      </w:r>
-    </w:p>
-    <w:p>
-      <w:pPr>
-        <w:pStyle w:val="Heading1"/>
-      </w:pPr>
-      <w:r>
-        <w:t>Automated Documentation Update</w:t>
-      </w:r>
-    </w:p>
-    <w:p>
-      <w:r>
-        <w:t>Timestamp: 2026-07-09 10:09:02 UTC</w:t>
-      </w:r>
-    </w:p>
-    <w:p>
-      <w:r>
-        <w:t>Repository: TechDocker</w:t>
-      </w:r>
-    </w:p>
-    <w:p>
-      <w:r>
-        <w:t>Branch: main</w:t>
-      </w:r>
-    </w:p>
-    <w:p>
-      <w:r>
-        <w:t>Actor: AdrenalIsland1</w:t>
-      </w:r>
-    </w:p>
-    <w:p>
-      <w:r>
-        <w:t>Before SHA: 3049499b383660629b6779a6b760c5a4661079c0</w:t>
-      </w:r>
-    </w:p>
-    <w:p>
-      <w:r>
-        <w:t>After SHA: d454d028cddecdddf9fb3109f6c68f0dbb1e8b8d</w:t>
-      </w:r>
-    </w:p>
-    <w:p>
-      <w:r>
-        <w:t>Project ID: techdocker</w:t>
-      </w:r>
-    </w:p>
-    <w:p>
-      <w:r>
-        <w:t>Document: techdocker_test1.docx</w:t>
-      </w:r>
-    </w:p>
-    <w:p>
-      <w:pPr>
-        <w:pStyle w:val="Heading2"/>
-      </w:pPr>
-      <w:r>
-        <w:t>Changed Files</w:t>
-      </w:r>
-    </w:p>
-    <w:p>
-      <w:r>
-        <w:t>- added: samples/~$chdocker_test1.docx</w:t>
-      </w:r>
-    </w:p>
-    <w:p>
-      <w:r>
-        <w:t>- modified: tests/test2.txt</w:t>
-      </w:r>
-    </w:p>
-    <w:p>
-      <w:r>
-        <w:t>This section was generated automatically by the TechDocker GitHub automation demo.</w:t>
-      </w:r>
-    </w:p>
     <w:sectPr>
       <w:pgSz w:w="12240" w:h="15840"/>
       <w:pgMar w:top="1440" w:right="1440" w:bottom="1440" w:left="1440" w:header="720" w:footer="720" w:gutter="0"/>

</xml_diff>